<commit_message>
Add debug slam to the report
</commit_message>
<xml_diff>
--- a/Report.docx
+++ b/Report.docx
@@ -3574,33 +3574,42 @@
     <w:p>
       <w:pPr>
         <w:pStyle w:val="Heading3"/>
-      </w:pPr>
-      <w:r>
-        <w:t xml:space="preserve">4.6 </w:t>
-      </w:r>
-      <w:r>
-        <w:t>Debugging Methodology: EKF-SLAM Validation Scripts</w:t>
-      </w:r>
-    </w:p>
-    <w:p>
-      <w:r>
-        <w:t xml:space="preserve">Three scripts were used to validate EKF-SLAM independently of the full stack (RRT explorer + </w:t>
-      </w:r>
-      <w:proofErr w:type="spellStart"/>
-      <w:r>
+        <w:rPr>
+          <w:lang w:val="en-US"/>
+        </w:rPr>
+      </w:pPr>
+      <w:r>
+        <w:rPr>
+          <w:lang w:val="en-US"/>
+        </w:rPr>
+        <w:t>4.6 Debugging and Validation Methodology</w:t>
+      </w:r>
+    </w:p>
+    <w:p>
+      <w:pPr>
+        <w:rPr>
+          <w:lang w:val="en-US"/>
+        </w:rPr>
+      </w:pPr>
+      <w:r>
+        <w:rPr>
+          <w:lang w:val="en-US"/>
+        </w:rPr>
+        <w:t xml:space="preserve">Before integrating the high-level autonomy stack (the RRT planner and </w:t>
+      </w:r>
+      <w:proofErr w:type="spellStart"/>
+      <w:r>
+        <w:rPr>
+          <w:lang w:val="en-US"/>
+        </w:rPr>
         <w:t>ArUco</w:t>
       </w:r>
       <w:proofErr w:type="spellEnd"/>
       <w:r>
-        <w:t xml:space="preserve"> monitor), alongside earlier manual teleoperation testing with a PS2 gamepad. Removing the planner and marker monitor eliminates every other writer to /</w:t>
-      </w:r>
-      <w:proofErr w:type="spellStart"/>
-      <w:r>
-        <w:t>cmd_vel</w:t>
-      </w:r>
-      <w:proofErr w:type="spellEnd"/>
-      <w:r>
-        <w:t>, so any pose or trajectory anomaly observed can be attributed to SLAM itself rather than to interference from other nodes.</w:t>
+        <w:rPr>
+          <w:lang w:val="en-US"/>
+        </w:rPr>
+        <w:t xml:space="preserve"> perception), it was critical to validate the EKF-SLAM system in strict isolation. To understand the baseline performance and the realistic limitations of our mapping foundation, we executed a two-phase validation methodology: first analyzing linear kinematic drift and then evaluating full-scale map fidelity via manual teleoperation.</w:t>
       </w:r>
     </w:p>
     <w:p>
@@ -3608,192 +3617,173 @@
         <w:rPr>
           <w:b/>
           <w:bCs/>
+          <w:lang w:val="en-US"/>
         </w:rPr>
       </w:pPr>
       <w:r>
         <w:rPr>
           <w:b/>
           <w:bCs/>
-        </w:rPr>
-        <w:t>1. debugslam.py</w:t>
-      </w:r>
+          <w:lang w:val="en-US"/>
+        </w:rPr>
+        <w:t>Phase 1: Kinematic Baseline and Drift Analysis</w:t>
+      </w:r>
+    </w:p>
+    <w:p>
+      <w:pPr>
+        <w:rPr>
+          <w:lang w:val="en-US"/>
+        </w:rPr>
+      </w:pPr>
+      <w:r>
+        <w:rPr>
+          <w:lang w:val="en-US"/>
+        </w:rPr>
+        <w:t>The first objective was to observe how the physical robot behaved during pure open-loop motion and verify that the EKF was actively attempting to correct the pose. To test this without interference from the navigation nodes, we wrote two dedicated testing scripts: debugslam.py and debugplot.py.</w:t>
+      </w:r>
+    </w:p>
+    <w:p>
+      <w:pPr>
+        <w:numPr>
+          <w:ilvl w:val="0"/>
+          <w:numId w:val="25"/>
+        </w:numPr>
+        <w:rPr>
+          <w:lang w:val="en-US"/>
+        </w:rPr>
+      </w:pPr>
       <w:r>
         <w:rPr>
           <w:b/>
           <w:bCs/>
-        </w:rPr>
-        <w:t xml:space="preserve"> -</w:t>
-      </w:r>
+          <w:lang w:val="en-US"/>
+        </w:rPr>
+        <w:t>What we did:</w:t>
+      </w:r>
+      <w:r>
+        <w:rPr>
+          <w:lang w:val="en-US"/>
+        </w:rPr>
+        <w:t xml:space="preserve"> We used debugslam.py to bypass all path-planning logic and inject a continuous, open-loop forward linear velocity (</w:t>
+      </w:r>
+      <m:oMath>
+        <m:sSub>
+          <m:sSubPr>
+            <m:ctrlPr>
+              <w:rPr>
+                <w:rFonts w:ascii="Cambria Math" w:hAnsi="Cambria Math"/>
+                <w:lang w:val="el-GR"/>
+              </w:rPr>
+            </m:ctrlPr>
+          </m:sSubPr>
+          <m:e>
+            <m:r>
+              <w:rPr>
+                <w:rFonts w:ascii="Cambria Math" w:hAnsi="Cambria Math"/>
+                <w:lang w:val="el-GR"/>
+              </w:rPr>
+              <m:t>v</m:t>
+            </m:r>
+          </m:e>
+          <m:sub>
+            <m:r>
+              <w:rPr>
+                <w:rFonts w:ascii="Cambria Math" w:hAnsi="Cambria Math"/>
+                <w:lang w:val="el-GR"/>
+              </w:rPr>
+              <m:t>x</m:t>
+            </m:r>
+          </m:sub>
+        </m:sSub>
+        <m:r>
+          <w:rPr>
+            <w:rFonts w:ascii="Cambria Math" w:hAnsi="Cambria Math"/>
+            <w:lang w:val="en-US"/>
+          </w:rPr>
+          <m:t>=0.08</m:t>
+        </m:r>
+        <m:r>
+          <m:rPr>
+            <m:nor/>
+          </m:rPr>
+          <w:rPr>
+            <w:lang w:val="en-US"/>
+          </w:rPr>
+          <m:t> m/s</m:t>
+        </m:r>
+      </m:oMath>
+      <w:r>
+        <w:rPr>
+          <w:lang w:val="en-US"/>
+        </w:rPr>
+        <w:t>) directly to the /</w:t>
+      </w:r>
+      <w:proofErr w:type="spellStart"/>
+      <w:r>
+        <w:rPr>
+          <w:lang w:val="en-US"/>
+        </w:rPr>
+        <w:t>cmd_vel</w:t>
+      </w:r>
+      <w:proofErr w:type="spellEnd"/>
+      <w:r>
+        <w:rPr>
+          <w:lang w:val="en-US"/>
+        </w:rPr>
+        <w:t xml:space="preserve"> topic. While the robot drove, we ran debugplot.py, a live visualization tool that plotted the raw, uncorrected odometry (as a dashed blue line) alongside the EKF-corrected SLAM pose (as a solid red line) in real-time, enforcing an equal aspect ratio to prevent visual distortion.</w:t>
+      </w:r>
+    </w:p>
+    <w:p>
+      <w:pPr>
+        <w:numPr>
+          <w:ilvl w:val="0"/>
+          <w:numId w:val="25"/>
+        </w:numPr>
+        <w:rPr>
+          <w:lang w:val="en-US"/>
+        </w:rPr>
+      </w:pPr>
       <w:r>
         <w:rPr>
           <w:b/>
           <w:bCs/>
-        </w:rPr>
-        <w:t xml:space="preserve"> Straight-Line SLAM Test</w:t>
-      </w:r>
-    </w:p>
-    <w:p>
-      <w:r>
-        <w:t>debugslam.py runs EKF-SLAM live against a known, simple trajectory</w:t>
-      </w:r>
-      <w:r>
-        <w:t xml:space="preserve">, </w:t>
-      </w:r>
-      <w:r>
-        <w:t xml:space="preserve">so that any curvature, drift, or jump in the SLAM output is immediately diagnostic rather than something that </w:t>
+          <w:lang w:val="en-US"/>
+        </w:rPr>
+        <w:t>Why we did it:</w:t>
+      </w:r>
+      <w:r>
+        <w:rPr>
+          <w:lang w:val="en-US"/>
+        </w:rPr>
+        <w:t xml:space="preserve"> Because the commanded path was mathematically straight, any deviation observed in the physical robot's trajectory was known to be hardware drift or wheel slip. Comparing the two plotted lines allowed us to visually evaluate </w:t>
       </w:r>
       <w:proofErr w:type="gramStart"/>
       <w:r>
-        <w:t>has to</w:t>
+        <w:rPr>
+          <w:lang w:val="en-US"/>
+        </w:rPr>
+        <w:t>the EKF's</w:t>
       </w:r>
       <w:proofErr w:type="gramEnd"/>
       <w:r>
-        <w:t xml:space="preserve"> be inferred from a more complex path. Its </w:t>
-      </w:r>
-      <w:proofErr w:type="spellStart"/>
-      <w:r>
-        <w:t>StraightCmdTest</w:t>
-      </w:r>
-      <w:proofErr w:type="spellEnd"/>
-      <w:r>
-        <w:t xml:space="preserve"> node publishes a Twist message with </w:t>
-      </w:r>
-      <w:proofErr w:type="spellStart"/>
-      <w:r>
-        <w:t>linear.x</w:t>
-      </w:r>
-      <w:proofErr w:type="spellEnd"/>
-      <w:r>
-        <w:t>=0.08 on /</w:t>
-      </w:r>
-      <w:proofErr w:type="spellStart"/>
-      <w:r>
-        <w:t>cmd_vel</w:t>
-      </w:r>
-      <w:proofErr w:type="spellEnd"/>
-      <w:r>
-        <w:t xml:space="preserve"> continuously, driven by a 20 Hz ROS timer, producing pure open-loop straight-line motion with no turning and no operator input. </w:t>
-      </w:r>
-      <w:proofErr w:type="gramStart"/>
-      <w:r>
-        <w:t>main(</w:t>
-      </w:r>
-      <w:proofErr w:type="gramEnd"/>
-      <w:r>
-        <w:t xml:space="preserve">) wires </w:t>
-      </w:r>
-      <w:proofErr w:type="spellStart"/>
-      <w:r>
-        <w:t>LidarSensor</w:t>
-      </w:r>
-      <w:proofErr w:type="spellEnd"/>
-      <w:r>
-        <w:t xml:space="preserve">, </w:t>
-      </w:r>
-      <w:proofErr w:type="spellStart"/>
-      <w:r>
-        <w:t>OdometrySensor</w:t>
-      </w:r>
-      <w:proofErr w:type="spellEnd"/>
-      <w:r>
-        <w:t xml:space="preserve">, </w:t>
-      </w:r>
-      <w:proofErr w:type="spellStart"/>
-      <w:r>
-        <w:t>ScanPreprocessor</w:t>
-      </w:r>
-      <w:proofErr w:type="spellEnd"/>
-      <w:r>
-        <w:t xml:space="preserve">, and </w:t>
-      </w:r>
-      <w:proofErr w:type="spellStart"/>
-      <w:r>
-        <w:t>OmniMotionModel</w:t>
-      </w:r>
-      <w:proofErr w:type="spellEnd"/>
-      <w:r>
-        <w:t xml:space="preserve"> into </w:t>
-      </w:r>
-      <w:proofErr w:type="spellStart"/>
-      <w:r>
-        <w:t>EKFLidarSLAM</w:t>
-      </w:r>
-      <w:proofErr w:type="spellEnd"/>
-      <w:r>
-        <w:t xml:space="preserve"> using the constructor-injection pattern, then adds all four nodes</w:t>
-      </w:r>
-      <w:r>
-        <w:t>-</w:t>
-      </w:r>
-      <w:r>
-        <w:t xml:space="preserve">lidar, </w:t>
-      </w:r>
-      <w:proofErr w:type="spellStart"/>
-      <w:r>
-        <w:t>odom</w:t>
-      </w:r>
-      <w:proofErr w:type="spellEnd"/>
-      <w:r>
-        <w:t xml:space="preserve">, </w:t>
-      </w:r>
-      <w:proofErr w:type="spellStart"/>
-      <w:r>
-        <w:t>straight_test</w:t>
-      </w:r>
-      <w:proofErr w:type="spellEnd"/>
-      <w:r>
-        <w:t>, and slam</w:t>
-      </w:r>
-      <w:r>
-        <w:t>-</w:t>
-      </w:r>
-      <w:r>
-        <w:t xml:space="preserve">to a single </w:t>
-      </w:r>
-      <w:proofErr w:type="spellStart"/>
-      <w:r>
-        <w:t>MultiThreadedExecutor</w:t>
-      </w:r>
-      <w:proofErr w:type="spellEnd"/>
-      <w:r>
-        <w:t xml:space="preserve"> and spins them together. On shutdown, </w:t>
-      </w:r>
-      <w:proofErr w:type="spellStart"/>
-      <w:r>
-        <w:t>stop_</w:t>
-      </w:r>
-      <w:proofErr w:type="gramStart"/>
-      <w:r>
-        <w:t>robot</w:t>
-      </w:r>
-      <w:proofErr w:type="spellEnd"/>
-      <w:r>
-        <w:t>(</w:t>
-      </w:r>
-      <w:proofErr w:type="gramEnd"/>
-      <w:r>
-        <w:t xml:space="preserve">) flushes ten zero-Twist messages to guard against publish loss, and </w:t>
-      </w:r>
-      <w:proofErr w:type="spellStart"/>
-      <w:r>
-        <w:t>slam.print_debug_</w:t>
-      </w:r>
-      <w:proofErr w:type="gramStart"/>
-      <w:r>
-        <w:t>summary</w:t>
-      </w:r>
-      <w:proofErr w:type="spellEnd"/>
-      <w:r>
-        <w:t>(</w:t>
-      </w:r>
-      <w:proofErr w:type="gramEnd"/>
-      <w:r>
-        <w:t>) dumps a final diagnostic summary before the nodes are destroyed.</w:t>
-      </w:r>
-    </w:p>
-    <w:p>
-      <w:r>
-        <w:t xml:space="preserve">Because the commanded path is known to be perfectly straight, a healthy SLAM estimate should read as a straight line as well; any bend in the corrected pose points directly at a problem in the estimator rather than in the motion being tested. </w:t>
+        <w:rPr>
+          <w:lang w:val="en-US"/>
+        </w:rPr>
+        <w:t xml:space="preserve"> correction behavior. In practice, the plots revealed that while the EKF significantly reduced the unbounded </w:t>
+      </w:r>
+      <w:proofErr w:type="spellStart"/>
+      <w:r>
+        <w:rPr>
+          <w:lang w:val="en-US"/>
+        </w:rPr>
+        <w:t>odometric</w:t>
+      </w:r>
+      <w:proofErr w:type="spellEnd"/>
+      <w:r>
+        <w:rPr>
+          <w:lang w:val="en-US"/>
+        </w:rPr>
+        <w:t xml:space="preserve"> drift, the resulting trajectory was not perfectly smooth; it occasionally exhibited discrete jumps when new landmark associations forced a sudden pose correction.</w:t>
       </w:r>
     </w:p>
     <w:p>
@@ -3801,177 +3791,94 @@
         <w:rPr>
           <w:b/>
           <w:bCs/>
+          <w:lang w:val="en-US"/>
         </w:rPr>
       </w:pPr>
       <w:r>
         <w:rPr>
           <w:b/>
           <w:bCs/>
-        </w:rPr>
-        <w:t xml:space="preserve">2. debugplot.py </w:t>
-      </w:r>
+          <w:lang w:val="en-US"/>
+        </w:rPr>
+        <w:t>Phase 2: Full Map Generation and Ground Truth Comparison</w:t>
+      </w:r>
+    </w:p>
+    <w:p>
+      <w:pPr>
+        <w:rPr>
+          <w:lang w:val="en-US"/>
+        </w:rPr>
+      </w:pPr>
+      <w:r>
+        <w:rPr>
+          <w:lang w:val="en-US"/>
+        </w:rPr>
+        <w:t>Once the straight-line localization behavior was understood, we needed to validate the occupancy grid generation and the stability of the landmark candidate buffer under complex, real-world maneuvers (like sharp turns, reversing, and loop closures).</w:t>
+      </w:r>
+    </w:p>
+    <w:p>
+      <w:pPr>
+        <w:numPr>
+          <w:ilvl w:val="0"/>
+          <w:numId w:val="26"/>
+        </w:numPr>
+        <w:rPr>
+          <w:lang w:val="en-US"/>
+        </w:rPr>
+      </w:pPr>
       <w:r>
         <w:rPr>
           <w:b/>
           <w:bCs/>
-        </w:rPr>
-        <w:t>-</w:t>
-      </w:r>
+          <w:lang w:val="en-US"/>
+        </w:rPr>
+        <w:lastRenderedPageBreak/>
+        <w:t>What we did:</w:t>
+      </w:r>
+      <w:r>
+        <w:rPr>
+          <w:lang w:val="en-US"/>
+        </w:rPr>
+        <w:t xml:space="preserve"> We entirely disabled the autonomous RRT explorer and instead manually drove the </w:t>
+      </w:r>
+      <w:proofErr w:type="spellStart"/>
+      <w:r>
+        <w:rPr>
+          <w:lang w:val="en-US"/>
+        </w:rPr>
+        <w:t>myAGV</w:t>
+      </w:r>
+      <w:proofErr w:type="spellEnd"/>
+      <w:r>
+        <w:rPr>
+          <w:lang w:val="en-US"/>
+        </w:rPr>
+        <w:t xml:space="preserve"> through the unknown maze using a PS2 gamepad controller. During this teleoperated run, the EKF-SLAM node ran passively in the background, extracting corners and building the log-odds grid map based on our manual driving.</w:t>
+      </w:r>
+    </w:p>
+    <w:p>
+      <w:pPr>
+        <w:numPr>
+          <w:ilvl w:val="0"/>
+          <w:numId w:val="26"/>
+        </w:numPr>
+        <w:rPr>
+          <w:lang w:val="en-US"/>
+        </w:rPr>
+      </w:pPr>
       <w:r>
         <w:rPr>
           <w:b/>
           <w:bCs/>
-        </w:rPr>
-        <w:t xml:space="preserve"> Live Trajectory Plot</w:t>
-      </w:r>
-    </w:p>
-    <w:p>
-      <w:r>
-        <w:t>debugplot.py is a read-only, non-actuating listener that visualizes /</w:t>
-      </w:r>
-      <w:proofErr w:type="spellStart"/>
-      <w:r>
-        <w:t>odom</w:t>
-      </w:r>
-      <w:proofErr w:type="spellEnd"/>
-      <w:r>
-        <w:t xml:space="preserve"> against /</w:t>
-      </w:r>
-      <w:proofErr w:type="spellStart"/>
-      <w:r>
-        <w:t>slam_pose</w:t>
-      </w:r>
-      <w:proofErr w:type="spellEnd"/>
-      <w:r>
-        <w:t xml:space="preserve"> in real </w:t>
-      </w:r>
-      <w:proofErr w:type="gramStart"/>
-      <w:r>
-        <w:t>time, and</w:t>
-      </w:r>
-      <w:proofErr w:type="gramEnd"/>
-      <w:r>
-        <w:t xml:space="preserve"> is intended to run alongside either test. Its </w:t>
-      </w:r>
-      <w:proofErr w:type="spellStart"/>
-      <w:r>
-        <w:t>DebugPlotNode</w:t>
-      </w:r>
-      <w:proofErr w:type="spellEnd"/>
-      <w:r>
-        <w:t xml:space="preserve"> subscribes to </w:t>
-      </w:r>
-      <w:proofErr w:type="spellStart"/>
-      <w:r>
-        <w:t>nav_msgs</w:t>
-      </w:r>
-      <w:proofErr w:type="spellEnd"/>
-      <w:r>
-        <w:t>/Odometry on /</w:t>
-      </w:r>
-      <w:proofErr w:type="spellStart"/>
-      <w:r>
-        <w:t>odom</w:t>
-      </w:r>
-      <w:proofErr w:type="spellEnd"/>
-      <w:r>
-        <w:t xml:space="preserve"> and </w:t>
-      </w:r>
-      <w:proofErr w:type="spellStart"/>
-      <w:r>
-        <w:t>geometry_msgs</w:t>
-      </w:r>
-      <w:proofErr w:type="spellEnd"/>
-      <w:r>
-        <w:t>/</w:t>
-      </w:r>
-      <w:proofErr w:type="spellStart"/>
-      <w:r>
-        <w:t>PoseWithCovarianceStamped</w:t>
-      </w:r>
-      <w:proofErr w:type="spellEnd"/>
-      <w:r>
-        <w:t xml:space="preserve"> on /</w:t>
-      </w:r>
-      <w:proofErr w:type="spellStart"/>
-      <w:r>
-        <w:t>slam_pose</w:t>
-      </w:r>
-      <w:proofErr w:type="spellEnd"/>
-      <w:r>
-        <w:t xml:space="preserve">, appending each incoming (x, y) position to a pair of parallel lists under a </w:t>
-      </w:r>
-      <w:proofErr w:type="spellStart"/>
-      <w:proofErr w:type="gramStart"/>
-      <w:r>
-        <w:t>threading.Lock</w:t>
-      </w:r>
-      <w:proofErr w:type="spellEnd"/>
-      <w:proofErr w:type="gramEnd"/>
-      <w:r>
-        <w:t xml:space="preserve">, since the ROS callback thread and the plotting thread run concurrently; </w:t>
-      </w:r>
-      <w:proofErr w:type="spellStart"/>
-      <w:r>
-        <w:t>get_</w:t>
-      </w:r>
-      <w:proofErr w:type="gramStart"/>
-      <w:r>
-        <w:t>data</w:t>
-      </w:r>
-      <w:proofErr w:type="spellEnd"/>
-      <w:r>
-        <w:t>(</w:t>
-      </w:r>
-      <w:proofErr w:type="gramEnd"/>
-      <w:r>
-        <w:t xml:space="preserve">) then returns a locked snapshot of both trajectories so the plotting side never reads a list mid-update. The </w:t>
-      </w:r>
-      <w:proofErr w:type="spellStart"/>
-      <w:r>
-        <w:t>LivePlot</w:t>
-      </w:r>
-      <w:proofErr w:type="spellEnd"/>
-      <w:r>
-        <w:t xml:space="preserve"> class draws raw odometry as a dashed blue line and the EKF-corrected </w:t>
-      </w:r>
-      <w:r>
-        <w:lastRenderedPageBreak/>
-        <w:t xml:space="preserve">estimate as a solid red </w:t>
-      </w:r>
-      <w:proofErr w:type="gramStart"/>
-      <w:r>
-        <w:t>line, and</w:t>
-      </w:r>
-      <w:proofErr w:type="gramEnd"/>
-      <w:r>
-        <w:t xml:space="preserve"> sets the axes to an equal aspect ratio so that a metre in </w:t>
-      </w:r>
-      <w:r>
-        <w:rPr>
-          <w:i/>
-          <w:iCs/>
-        </w:rPr>
-        <w:t>x</w:t>
-      </w:r>
-      <w:r>
-        <w:t xml:space="preserve"> is rendered the same length as a metre in </w:t>
-      </w:r>
-      <w:r>
-        <w:rPr>
-          <w:i/>
-          <w:iCs/>
-        </w:rPr>
-        <w:t>y</w:t>
-      </w:r>
-      <w:r>
-        <w:t xml:space="preserve"> </w:t>
-      </w:r>
-      <w:r>
-        <w:t>-</w:t>
-      </w:r>
-      <w:r>
-        <w:t xml:space="preserve"> without this, a turn's true angle would appear visually distorted on the plot. </w:t>
+          <w:lang w:val="en-US"/>
+        </w:rPr>
+        <w:t>Why we did it:</w:t>
+      </w:r>
+      <w:r>
+        <w:rPr>
+          <w:lang w:val="en-US"/>
+        </w:rPr>
+        <w:t xml:space="preserve"> Teleoperation decoupled the mapping performance from the path planner's logic. Once the maze was fully traversed, we compared the final generated occupancy grid displayed in RViz directly against the physical layout of the real maze. This visual comparison served as our ground-truth validation and highlighted the realistic limits of our system. While the overall dimensional scale of the map was reasonably accurate, the results were not flawless. We still observed instances of minor wall smearing during aggressive rotations and slight global misalignment as drift accumulated over the long run. However, the test proved that despite these real-world imperfections, the map remained topologically consistent and was sufficiently clean for the autonomous stack to navigate successfully.</w:t>
       </w:r>
     </w:p>
     <w:p/>
@@ -4176,6 +4083,7 @@
         <w:rPr>
           <w:noProof/>
         </w:rPr>
+        <w:lastRenderedPageBreak/>
         <w:drawing>
           <wp:inline distT="0" distB="0" distL="0" distR="0" wp14:anchorId="4CE608DF" wp14:editId="7BB96EBB">
             <wp:extent cx="3452813" cy="2902749"/>
@@ -4224,7 +4132,6 @@
         <w:pStyle w:val="Heading3"/>
       </w:pPr>
       <w:r>
-        <w:lastRenderedPageBreak/>
         <w:t>5</w:t>
       </w:r>
       <w:r>
@@ -4317,6 +4224,7 @@
         <w:rPr>
           <w:noProof/>
         </w:rPr>
+        <w:lastRenderedPageBreak/>
         <w:drawing>
           <wp:inline distT="0" distB="0" distL="0" distR="0" wp14:anchorId="674736CA" wp14:editId="320DDD98">
             <wp:extent cx="4457733" cy="3171848"/>
@@ -4450,208 +4358,208 @@
         <w:rPr>
           <w:bCs/>
         </w:rPr>
-        <w:t xml:space="preserve"> node, which samples the camera frame at a throttled rate of 5 Hz (a 0.2-second timer) to conserve CPU cycles. To prevent </w:t>
-      </w:r>
-      <w:r>
+        <w:t> node, which samples the camera frame at a throttled rate of 5 Hz (a 0.2-second timer) to conserve CPU cycles. To prevent the same camera frame from being counted multiple times toward detection confirmation, the node compares the timestamp of each incoming frame against the last processed timestamp and skips duplicates.</w:t>
+      </w:r>
+    </w:p>
+    <w:p>
+      <w:pPr>
         <w:rPr>
           <w:bCs/>
         </w:rPr>
+      </w:pPr>
+      <w:r>
+        <w:rPr>
+          <w:bCs/>
+        </w:rPr>
+        <w:t>For each new frame, it invokes the </w:t>
+      </w:r>
+      <w:proofErr w:type="spellStart"/>
+      <w:r>
+        <w:rPr>
+          <w:bCs/>
+        </w:rPr>
+        <w:t>ArucoDetector</w:t>
+      </w:r>
+      <w:proofErr w:type="spellEnd"/>
+      <w:r>
+        <w:rPr>
+          <w:bCs/>
+        </w:rPr>
+        <w:t>, which first converts the image to grayscale and then runs </w:t>
+      </w:r>
+      <w:proofErr w:type="gramStart"/>
+      <w:r>
+        <w:rPr>
+          <w:bCs/>
+        </w:rPr>
+        <w:t>cv2.aruco.ArucoDetector</w:t>
+      </w:r>
+      <w:proofErr w:type="gramEnd"/>
+      <w:r>
+        <w:rPr>
+          <w:bCs/>
+        </w:rPr>
+        <w:t> using the DICT_4X4_50 dictionary and default detector parameters. Upon successful detection, the pipeline calls </w:t>
+      </w:r>
+      <w:proofErr w:type="gramStart"/>
+      <w:r>
+        <w:rPr>
+          <w:bCs/>
+        </w:rPr>
+        <w:t>cv2.aruco.estimatePoseSingleMarkers</w:t>
+      </w:r>
+      <w:proofErr w:type="gramEnd"/>
+      <w:r>
+        <w:rPr>
+          <w:bCs/>
+        </w:rPr>
+        <w:t> to compute, for each detected marker, the rotation vector </w:t>
+      </w:r>
+      <w:proofErr w:type="spellStart"/>
+      <w:r>
+        <w:rPr>
+          <w:bCs/>
+        </w:rPr>
+        <w:t>rvec</w:t>
+      </w:r>
+      <w:proofErr w:type="spellEnd"/>
+      <w:r>
+        <w:rPr>
+          <w:bCs/>
+        </w:rPr>
+        <w:t> and the translation vector </w:t>
+      </w:r>
+      <w:proofErr w:type="spellStart"/>
+      <w:r>
+        <w:rPr>
+          <w:bCs/>
+        </w:rPr>
+        <w:t>tvec</w:t>
+      </w:r>
+      <w:proofErr w:type="spellEnd"/>
+      <w:r>
+        <w:rPr>
+          <w:bCs/>
+        </w:rPr>
+        <w:t xml:space="preserve"> = [</w:t>
+      </w:r>
+      <w:proofErr w:type="spellStart"/>
+      <w:r>
+        <w:rPr>
+          <w:bCs/>
+        </w:rPr>
+        <w:t>x_cam</w:t>
+      </w:r>
+      <w:proofErr w:type="spellEnd"/>
+      <w:r>
+        <w:rPr>
+          <w:bCs/>
+        </w:rPr>
+        <w:t xml:space="preserve">, </w:t>
+      </w:r>
+      <w:proofErr w:type="spellStart"/>
+      <w:r>
+        <w:rPr>
+          <w:bCs/>
+        </w:rPr>
+        <w:t>y_cam</w:t>
+      </w:r>
+      <w:proofErr w:type="spellEnd"/>
+      <w:r>
+        <w:rPr>
+          <w:bCs/>
+        </w:rPr>
+        <w:t xml:space="preserve">, </w:t>
+      </w:r>
+      <w:proofErr w:type="spellStart"/>
+      <w:r>
+        <w:rPr>
+          <w:bCs/>
+        </w:rPr>
+        <w:t>z_</w:t>
+      </w:r>
+      <w:proofErr w:type="gramStart"/>
+      <w:r>
+        <w:rPr>
+          <w:bCs/>
+        </w:rPr>
+        <w:t>cam</w:t>
+      </w:r>
+      <w:proofErr w:type="spellEnd"/>
+      <w:r>
+        <w:rPr>
+          <w:bCs/>
+        </w:rPr>
+        <w:t>]^</w:t>
+      </w:r>
+      <w:proofErr w:type="gramEnd"/>
+      <w:r>
+        <w:rPr>
+          <w:bCs/>
+        </w:rPr>
+        <w:t>T relative to the camera's optical centre. A full homogeneous transformation matrix </w:t>
+      </w:r>
+      <w:proofErr w:type="spellStart"/>
+      <w:r>
+        <w:rPr>
+          <w:bCs/>
+        </w:rPr>
+        <w:t>T_cm</w:t>
+      </w:r>
+      <w:proofErr w:type="spellEnd"/>
+      <w:r>
+        <w:rPr>
+          <w:bCs/>
+        </w:rPr>
+        <w:t> (marker frame → camera frame) is also constructed via the Rodrigues formula, though the primary localization path relies on </w:t>
+      </w:r>
+      <w:proofErr w:type="spellStart"/>
+      <w:r>
+        <w:rPr>
+          <w:bCs/>
+        </w:rPr>
+        <w:t>tvec</w:t>
+      </w:r>
+      <w:proofErr w:type="spellEnd"/>
+      <w:r>
+        <w:rPr>
+          <w:bCs/>
+        </w:rPr>
+        <w:t> directly. In the standard OpenCV camera frame the x-axis points right, the y-axis points down, and the z-axis points forward.</w:t>
+      </w:r>
+    </w:p>
+    <w:p>
+      <w:pPr>
+        <w:rPr>
+          <w:bCs/>
+        </w:rPr>
+      </w:pPr>
+      <w:r>
+        <w:rPr>
+          <w:bCs/>
+        </w:rPr>
+        <w:t>Confirmation gating. To avoid acting on a single spurious detection, every marker must be detected in at least </w:t>
+      </w:r>
+      <w:proofErr w:type="spellStart"/>
+      <w:r>
+        <w:rPr>
+          <w:bCs/>
+        </w:rPr>
+        <w:t>confirmation_frames</w:t>
+      </w:r>
+      <w:proofErr w:type="spellEnd"/>
+      <w:r>
+        <w:rPr>
+          <w:bCs/>
+        </w:rPr>
+        <w:t xml:space="preserve"> consecutive unique frames (default: 3, </w:t>
+      </w:r>
+      <w:r>
+        <w:rPr>
+          <w:bCs/>
+        </w:rPr>
         <w:lastRenderedPageBreak/>
-        <w:t>the same camera frame from being counted multiple times toward detection confirmation, the node compares the timestamp of each incoming frame against the last processed timestamp and skips duplicates.</w:t>
-      </w:r>
-    </w:p>
-    <w:p>
-      <w:pPr>
-        <w:rPr>
-          <w:bCs/>
-        </w:rPr>
-      </w:pPr>
-      <w:r>
-        <w:rPr>
-          <w:bCs/>
-        </w:rPr>
-        <w:t>For each new frame, it invokes the </w:t>
-      </w:r>
-      <w:proofErr w:type="spellStart"/>
-      <w:r>
-        <w:rPr>
-          <w:bCs/>
-        </w:rPr>
-        <w:t>ArucoDetector</w:t>
-      </w:r>
-      <w:proofErr w:type="spellEnd"/>
-      <w:r>
-        <w:rPr>
-          <w:bCs/>
-        </w:rPr>
-        <w:t>, which first converts the image to grayscale and then runs </w:t>
-      </w:r>
-      <w:proofErr w:type="gramStart"/>
-      <w:r>
-        <w:rPr>
-          <w:bCs/>
-        </w:rPr>
-        <w:t>cv2.aruco.ArucoDetector</w:t>
-      </w:r>
-      <w:proofErr w:type="gramEnd"/>
-      <w:r>
-        <w:rPr>
-          <w:bCs/>
-        </w:rPr>
-        <w:t> using the DICT_4X4_50 dictionary and default detector parameters. Upon successful detection, the pipeline calls </w:t>
-      </w:r>
-      <w:proofErr w:type="gramStart"/>
-      <w:r>
-        <w:rPr>
-          <w:bCs/>
-        </w:rPr>
-        <w:t>cv2.aruco.estimatePoseSingleMarkers</w:t>
-      </w:r>
-      <w:proofErr w:type="gramEnd"/>
-      <w:r>
-        <w:rPr>
-          <w:bCs/>
-        </w:rPr>
-        <w:t> to compute, for each detected marker, the rotation vector </w:t>
-      </w:r>
-      <w:proofErr w:type="spellStart"/>
-      <w:r>
-        <w:rPr>
-          <w:bCs/>
-        </w:rPr>
-        <w:t>rvec</w:t>
-      </w:r>
-      <w:proofErr w:type="spellEnd"/>
-      <w:r>
-        <w:rPr>
-          <w:bCs/>
-        </w:rPr>
-        <w:t> and the translation vector </w:t>
-      </w:r>
-      <w:proofErr w:type="spellStart"/>
-      <w:r>
-        <w:rPr>
-          <w:bCs/>
-        </w:rPr>
-        <w:t>tvec</w:t>
-      </w:r>
-      <w:proofErr w:type="spellEnd"/>
-      <w:r>
-        <w:rPr>
-          <w:bCs/>
-        </w:rPr>
-        <w:t xml:space="preserve"> = [</w:t>
-      </w:r>
-      <w:proofErr w:type="spellStart"/>
-      <w:r>
-        <w:rPr>
-          <w:bCs/>
-        </w:rPr>
-        <w:t>x_cam</w:t>
-      </w:r>
-      <w:proofErr w:type="spellEnd"/>
-      <w:r>
-        <w:rPr>
-          <w:bCs/>
-        </w:rPr>
-        <w:t xml:space="preserve">, </w:t>
-      </w:r>
-      <w:proofErr w:type="spellStart"/>
-      <w:r>
-        <w:rPr>
-          <w:bCs/>
-        </w:rPr>
-        <w:t>y_cam</w:t>
-      </w:r>
-      <w:proofErr w:type="spellEnd"/>
-      <w:r>
-        <w:rPr>
-          <w:bCs/>
-        </w:rPr>
-        <w:t xml:space="preserve">, </w:t>
-      </w:r>
-      <w:proofErr w:type="spellStart"/>
-      <w:r>
-        <w:rPr>
-          <w:bCs/>
-        </w:rPr>
-        <w:t>z_</w:t>
-      </w:r>
-      <w:proofErr w:type="gramStart"/>
-      <w:r>
-        <w:rPr>
-          <w:bCs/>
-        </w:rPr>
-        <w:t>cam</w:t>
-      </w:r>
-      <w:proofErr w:type="spellEnd"/>
-      <w:r>
-        <w:rPr>
-          <w:bCs/>
-        </w:rPr>
-        <w:t>]^</w:t>
-      </w:r>
-      <w:proofErr w:type="gramEnd"/>
-      <w:r>
-        <w:rPr>
-          <w:bCs/>
-        </w:rPr>
-        <w:t>T relative to the camera's optical centre. A full homogeneous transformation matrix </w:t>
-      </w:r>
-      <w:proofErr w:type="spellStart"/>
-      <w:r>
-        <w:rPr>
-          <w:bCs/>
-        </w:rPr>
-        <w:t>T_cm</w:t>
-      </w:r>
-      <w:proofErr w:type="spellEnd"/>
-      <w:r>
-        <w:rPr>
-          <w:bCs/>
-        </w:rPr>
-        <w:t> (marker frame → camera frame) is also constructed via the Rodrigues formula, though the primary localization path relies on </w:t>
-      </w:r>
-      <w:proofErr w:type="spellStart"/>
-      <w:r>
-        <w:rPr>
-          <w:bCs/>
-        </w:rPr>
-        <w:t>tvec</w:t>
-      </w:r>
-      <w:proofErr w:type="spellEnd"/>
-      <w:r>
-        <w:rPr>
-          <w:bCs/>
-        </w:rPr>
-        <w:t> directly. In the standard OpenCV camera frame the x-axis points right, the y-axis points down, and the z-axis points forward.</w:t>
-      </w:r>
-    </w:p>
-    <w:p>
-      <w:pPr>
-        <w:rPr>
-          <w:bCs/>
-        </w:rPr>
-      </w:pPr>
-      <w:r>
-        <w:rPr>
-          <w:bCs/>
-        </w:rPr>
-        <w:t>Confirmation gating. To avoid acting on a single spurious detection, every marker must be detected in at least </w:t>
-      </w:r>
-      <w:proofErr w:type="spellStart"/>
-      <w:r>
-        <w:rPr>
-          <w:bCs/>
-        </w:rPr>
-        <w:t>confirmation_frames</w:t>
-      </w:r>
-      <w:proofErr w:type="spellEnd"/>
-      <w:r>
-        <w:rPr>
-          <w:bCs/>
-        </w:rPr>
-        <w:t> consecutive unique frames (default: 3, loaded from </w:t>
+        <w:t>loaded from </w:t>
       </w:r>
       <w:hyperlink r:id="rId13" w:tgtFrame="_blank" w:history="1">
         <w:r>
@@ -5551,11 +5459,7 @@
       </w:r>
       <w:proofErr w:type="spellEnd"/>
       <w:r>
-        <w:t xml:space="preserve"> maintains an incremental running mean over all observations of each marker. Every new observation is blended with the prior average weighted by </w:t>
-      </w:r>
-      <w:r>
-        <w:lastRenderedPageBreak/>
-        <w:t>observation count, so the estimated world position converges smoothly without storing the full history.</w:t>
+        <w:t> maintains an incremental running mean over all observations of each marker. Every new observation is blended with the prior average weighted by observation count, so the estimated world position converges smoothly without storing the full history.</w:t>
       </w:r>
     </w:p>
     <w:p>
@@ -5745,6 +5649,7 @@
     </w:p>
     <w:p>
       <w:r>
+        <w:lastRenderedPageBreak/>
         <w:t xml:space="preserve">  "</w:t>
       </w:r>
       <w:proofErr w:type="spellStart"/>
@@ -5981,11 +5886,7 @@
       </w:r>
       <w:proofErr w:type="spellEnd"/>
       <w:r>
-        <w:t xml:space="preserve">) is called. This inserts the segment between the two markers as a solid obstacle into the </w:t>
-      </w:r>
-      <w:r>
-        <w:lastRenderedPageBreak/>
-        <w:t xml:space="preserve">RRT </w:t>
+        <w:t xml:space="preserve">) is called. This inserts the segment between the two markers as a solid obstacle into the RRT </w:t>
       </w:r>
       <w:proofErr w:type="spellStart"/>
       <w:r>
@@ -6143,6 +6044,7 @@
         <w:pStyle w:val="Heading3"/>
       </w:pPr>
       <w:r>
+        <w:lastRenderedPageBreak/>
         <w:t>Section 7.</w:t>
       </w:r>
       <w:r>
@@ -6164,11 +6066,7 @@
         <w:t>we</w:t>
       </w:r>
       <w:r>
-        <w:t xml:space="preserve"> can watch the RRT tree expand toward unexplored frontiers in RViz in real time. This corresponds to the standard global-planner / local-planner separation used in production mobile-robotics stacks: the global planner (RRT) computes where to go, and the local planner (SafeLidarMotion) </w:t>
-      </w:r>
-      <w:r>
-        <w:lastRenderedPageBreak/>
-        <w:t>handles how to get there without hitting anything.</w:t>
+        <w:t xml:space="preserve"> can watch the RRT tree expand toward unexplored frontiers in RViz in real time. This corresponds to the standard global-planner / local-planner separation used in production mobile-robotics stacks: the global planner (RRT) computes where to go, and the local planner (SafeLidarMotion) handles how to get there without hitting anything.</w:t>
       </w:r>
       <w:r>
         <w:br/>
@@ -6834,6 +6732,155 @@
     </w:lvl>
   </w:abstractNum>
   <w:abstractNum w:abstractNumId="5" w15:restartNumberingAfterBreak="0">
+    <w:nsid w:val="071260E8"/>
+    <w:multiLevelType w:val="multilevel"/>
+    <w:tmpl w:val="D2EC5688"/>
+    <w:lvl w:ilvl="0">
+      <w:start w:val="1"/>
+      <w:numFmt w:val="bullet"/>
+      <w:lvlText w:val=""/>
+      <w:lvlJc w:val="left"/>
+      <w:pPr>
+        <w:tabs>
+          <w:tab w:val="num" w:pos="720"/>
+        </w:tabs>
+        <w:ind w:left="720" w:hanging="360"/>
+      </w:pPr>
+      <w:rPr>
+        <w:rFonts w:ascii="Symbol" w:hAnsi="Symbol" w:hint="default"/>
+        <w:sz w:val="20"/>
+      </w:rPr>
+    </w:lvl>
+    <w:lvl w:ilvl="1" w:tentative="1">
+      <w:start w:val="1"/>
+      <w:numFmt w:val="bullet"/>
+      <w:lvlText w:val="o"/>
+      <w:lvlJc w:val="left"/>
+      <w:pPr>
+        <w:tabs>
+          <w:tab w:val="num" w:pos="1440"/>
+        </w:tabs>
+        <w:ind w:left="1440" w:hanging="360"/>
+      </w:pPr>
+      <w:rPr>
+        <w:rFonts w:ascii="Courier New" w:hAnsi="Courier New" w:hint="default"/>
+        <w:sz w:val="20"/>
+      </w:rPr>
+    </w:lvl>
+    <w:lvl w:ilvl="2" w:tentative="1">
+      <w:start w:val="1"/>
+      <w:numFmt w:val="bullet"/>
+      <w:lvlText w:val=""/>
+      <w:lvlJc w:val="left"/>
+      <w:pPr>
+        <w:tabs>
+          <w:tab w:val="num" w:pos="2160"/>
+        </w:tabs>
+        <w:ind w:left="2160" w:hanging="360"/>
+      </w:pPr>
+      <w:rPr>
+        <w:rFonts w:ascii="Wingdings" w:hAnsi="Wingdings" w:hint="default"/>
+        <w:sz w:val="20"/>
+      </w:rPr>
+    </w:lvl>
+    <w:lvl w:ilvl="3" w:tentative="1">
+      <w:start w:val="1"/>
+      <w:numFmt w:val="bullet"/>
+      <w:lvlText w:val=""/>
+      <w:lvlJc w:val="left"/>
+      <w:pPr>
+        <w:tabs>
+          <w:tab w:val="num" w:pos="2880"/>
+        </w:tabs>
+        <w:ind w:left="2880" w:hanging="360"/>
+      </w:pPr>
+      <w:rPr>
+        <w:rFonts w:ascii="Wingdings" w:hAnsi="Wingdings" w:hint="default"/>
+        <w:sz w:val="20"/>
+      </w:rPr>
+    </w:lvl>
+    <w:lvl w:ilvl="4" w:tentative="1">
+      <w:start w:val="1"/>
+      <w:numFmt w:val="bullet"/>
+      <w:lvlText w:val=""/>
+      <w:lvlJc w:val="left"/>
+      <w:pPr>
+        <w:tabs>
+          <w:tab w:val="num" w:pos="3600"/>
+        </w:tabs>
+        <w:ind w:left="3600" w:hanging="360"/>
+      </w:pPr>
+      <w:rPr>
+        <w:rFonts w:ascii="Wingdings" w:hAnsi="Wingdings" w:hint="default"/>
+        <w:sz w:val="20"/>
+      </w:rPr>
+    </w:lvl>
+    <w:lvl w:ilvl="5" w:tentative="1">
+      <w:start w:val="1"/>
+      <w:numFmt w:val="bullet"/>
+      <w:lvlText w:val=""/>
+      <w:lvlJc w:val="left"/>
+      <w:pPr>
+        <w:tabs>
+          <w:tab w:val="num" w:pos="4320"/>
+        </w:tabs>
+        <w:ind w:left="4320" w:hanging="360"/>
+      </w:pPr>
+      <w:rPr>
+        <w:rFonts w:ascii="Wingdings" w:hAnsi="Wingdings" w:hint="default"/>
+        <w:sz w:val="20"/>
+      </w:rPr>
+    </w:lvl>
+    <w:lvl w:ilvl="6" w:tentative="1">
+      <w:start w:val="1"/>
+      <w:numFmt w:val="bullet"/>
+      <w:lvlText w:val=""/>
+      <w:lvlJc w:val="left"/>
+      <w:pPr>
+        <w:tabs>
+          <w:tab w:val="num" w:pos="5040"/>
+        </w:tabs>
+        <w:ind w:left="5040" w:hanging="360"/>
+      </w:pPr>
+      <w:rPr>
+        <w:rFonts w:ascii="Wingdings" w:hAnsi="Wingdings" w:hint="default"/>
+        <w:sz w:val="20"/>
+      </w:rPr>
+    </w:lvl>
+    <w:lvl w:ilvl="7" w:tentative="1">
+      <w:start w:val="1"/>
+      <w:numFmt w:val="bullet"/>
+      <w:lvlText w:val=""/>
+      <w:lvlJc w:val="left"/>
+      <w:pPr>
+        <w:tabs>
+          <w:tab w:val="num" w:pos="5760"/>
+        </w:tabs>
+        <w:ind w:left="5760" w:hanging="360"/>
+      </w:pPr>
+      <w:rPr>
+        <w:rFonts w:ascii="Wingdings" w:hAnsi="Wingdings" w:hint="default"/>
+        <w:sz w:val="20"/>
+      </w:rPr>
+    </w:lvl>
+    <w:lvl w:ilvl="8" w:tentative="1">
+      <w:start w:val="1"/>
+      <w:numFmt w:val="bullet"/>
+      <w:lvlText w:val=""/>
+      <w:lvlJc w:val="left"/>
+      <w:pPr>
+        <w:tabs>
+          <w:tab w:val="num" w:pos="6480"/>
+        </w:tabs>
+        <w:ind w:left="6480" w:hanging="360"/>
+      </w:pPr>
+      <w:rPr>
+        <w:rFonts w:ascii="Wingdings" w:hAnsi="Wingdings" w:hint="default"/>
+        <w:sz w:val="20"/>
+      </w:rPr>
+    </w:lvl>
+  </w:abstractNum>
+  <w:abstractNum w:abstractNumId="6" w15:restartNumberingAfterBreak="0">
     <w:nsid w:val="09006AEE"/>
     <w:multiLevelType w:val="multilevel"/>
     <w:tmpl w:val="15EED292"/>
@@ -6946,7 +6993,7 @@
       </w:rPr>
     </w:lvl>
   </w:abstractNum>
-  <w:abstractNum w:abstractNumId="6" w15:restartNumberingAfterBreak="0">
+  <w:abstractNum w:abstractNumId="7" w15:restartNumberingAfterBreak="0">
     <w:nsid w:val="0BBD73AF"/>
     <w:multiLevelType w:val="multilevel"/>
     <w:tmpl w:val="A8ECD798"/>
@@ -7095,7 +7142,7 @@
       </w:rPr>
     </w:lvl>
   </w:abstractNum>
-  <w:abstractNum w:abstractNumId="7" w15:restartNumberingAfterBreak="0">
+  <w:abstractNum w:abstractNumId="8" w15:restartNumberingAfterBreak="0">
     <w:nsid w:val="0CBC27B4"/>
     <w:multiLevelType w:val="multilevel"/>
     <w:tmpl w:val="A8DA441E"/>
@@ -7244,7 +7291,7 @@
       </w:rPr>
     </w:lvl>
   </w:abstractNum>
-  <w:abstractNum w:abstractNumId="8" w15:restartNumberingAfterBreak="0">
+  <w:abstractNum w:abstractNumId="9" w15:restartNumberingAfterBreak="0">
     <w:nsid w:val="0CE02056"/>
     <w:multiLevelType w:val="multilevel"/>
     <w:tmpl w:val="6362237E"/>
@@ -7393,7 +7440,7 @@
       </w:rPr>
     </w:lvl>
   </w:abstractNum>
-  <w:abstractNum w:abstractNumId="9" w15:restartNumberingAfterBreak="0">
+  <w:abstractNum w:abstractNumId="10" w15:restartNumberingAfterBreak="0">
     <w:nsid w:val="0FF267A3"/>
     <w:multiLevelType w:val="multilevel"/>
     <w:tmpl w:val="26FAA844"/>
@@ -7542,7 +7589,156 @@
       </w:rPr>
     </w:lvl>
   </w:abstractNum>
-  <w:abstractNum w:abstractNumId="10" w15:restartNumberingAfterBreak="0">
+  <w:abstractNum w:abstractNumId="11" w15:restartNumberingAfterBreak="0">
+    <w:nsid w:val="10EB39D2"/>
+    <w:multiLevelType w:val="multilevel"/>
+    <w:tmpl w:val="E084CF94"/>
+    <w:lvl w:ilvl="0">
+      <w:start w:val="1"/>
+      <w:numFmt w:val="bullet"/>
+      <w:lvlText w:val=""/>
+      <w:lvlJc w:val="left"/>
+      <w:pPr>
+        <w:tabs>
+          <w:tab w:val="num" w:pos="720"/>
+        </w:tabs>
+        <w:ind w:left="720" w:hanging="360"/>
+      </w:pPr>
+      <w:rPr>
+        <w:rFonts w:ascii="Symbol" w:hAnsi="Symbol" w:hint="default"/>
+        <w:sz w:val="20"/>
+      </w:rPr>
+    </w:lvl>
+    <w:lvl w:ilvl="1" w:tentative="1">
+      <w:start w:val="1"/>
+      <w:numFmt w:val="bullet"/>
+      <w:lvlText w:val="o"/>
+      <w:lvlJc w:val="left"/>
+      <w:pPr>
+        <w:tabs>
+          <w:tab w:val="num" w:pos="1440"/>
+        </w:tabs>
+        <w:ind w:left="1440" w:hanging="360"/>
+      </w:pPr>
+      <w:rPr>
+        <w:rFonts w:ascii="Courier New" w:hAnsi="Courier New" w:hint="default"/>
+        <w:sz w:val="20"/>
+      </w:rPr>
+    </w:lvl>
+    <w:lvl w:ilvl="2" w:tentative="1">
+      <w:start w:val="1"/>
+      <w:numFmt w:val="bullet"/>
+      <w:lvlText w:val=""/>
+      <w:lvlJc w:val="left"/>
+      <w:pPr>
+        <w:tabs>
+          <w:tab w:val="num" w:pos="2160"/>
+        </w:tabs>
+        <w:ind w:left="2160" w:hanging="360"/>
+      </w:pPr>
+      <w:rPr>
+        <w:rFonts w:ascii="Wingdings" w:hAnsi="Wingdings" w:hint="default"/>
+        <w:sz w:val="20"/>
+      </w:rPr>
+    </w:lvl>
+    <w:lvl w:ilvl="3" w:tentative="1">
+      <w:start w:val="1"/>
+      <w:numFmt w:val="bullet"/>
+      <w:lvlText w:val=""/>
+      <w:lvlJc w:val="left"/>
+      <w:pPr>
+        <w:tabs>
+          <w:tab w:val="num" w:pos="2880"/>
+        </w:tabs>
+        <w:ind w:left="2880" w:hanging="360"/>
+      </w:pPr>
+      <w:rPr>
+        <w:rFonts w:ascii="Wingdings" w:hAnsi="Wingdings" w:hint="default"/>
+        <w:sz w:val="20"/>
+      </w:rPr>
+    </w:lvl>
+    <w:lvl w:ilvl="4" w:tentative="1">
+      <w:start w:val="1"/>
+      <w:numFmt w:val="bullet"/>
+      <w:lvlText w:val=""/>
+      <w:lvlJc w:val="left"/>
+      <w:pPr>
+        <w:tabs>
+          <w:tab w:val="num" w:pos="3600"/>
+        </w:tabs>
+        <w:ind w:left="3600" w:hanging="360"/>
+      </w:pPr>
+      <w:rPr>
+        <w:rFonts w:ascii="Wingdings" w:hAnsi="Wingdings" w:hint="default"/>
+        <w:sz w:val="20"/>
+      </w:rPr>
+    </w:lvl>
+    <w:lvl w:ilvl="5" w:tentative="1">
+      <w:start w:val="1"/>
+      <w:numFmt w:val="bullet"/>
+      <w:lvlText w:val=""/>
+      <w:lvlJc w:val="left"/>
+      <w:pPr>
+        <w:tabs>
+          <w:tab w:val="num" w:pos="4320"/>
+        </w:tabs>
+        <w:ind w:left="4320" w:hanging="360"/>
+      </w:pPr>
+      <w:rPr>
+        <w:rFonts w:ascii="Wingdings" w:hAnsi="Wingdings" w:hint="default"/>
+        <w:sz w:val="20"/>
+      </w:rPr>
+    </w:lvl>
+    <w:lvl w:ilvl="6" w:tentative="1">
+      <w:start w:val="1"/>
+      <w:numFmt w:val="bullet"/>
+      <w:lvlText w:val=""/>
+      <w:lvlJc w:val="left"/>
+      <w:pPr>
+        <w:tabs>
+          <w:tab w:val="num" w:pos="5040"/>
+        </w:tabs>
+        <w:ind w:left="5040" w:hanging="360"/>
+      </w:pPr>
+      <w:rPr>
+        <w:rFonts w:ascii="Wingdings" w:hAnsi="Wingdings" w:hint="default"/>
+        <w:sz w:val="20"/>
+      </w:rPr>
+    </w:lvl>
+    <w:lvl w:ilvl="7" w:tentative="1">
+      <w:start w:val="1"/>
+      <w:numFmt w:val="bullet"/>
+      <w:lvlText w:val=""/>
+      <w:lvlJc w:val="left"/>
+      <w:pPr>
+        <w:tabs>
+          <w:tab w:val="num" w:pos="5760"/>
+        </w:tabs>
+        <w:ind w:left="5760" w:hanging="360"/>
+      </w:pPr>
+      <w:rPr>
+        <w:rFonts w:ascii="Wingdings" w:hAnsi="Wingdings" w:hint="default"/>
+        <w:sz w:val="20"/>
+      </w:rPr>
+    </w:lvl>
+    <w:lvl w:ilvl="8" w:tentative="1">
+      <w:start w:val="1"/>
+      <w:numFmt w:val="bullet"/>
+      <w:lvlText w:val=""/>
+      <w:lvlJc w:val="left"/>
+      <w:pPr>
+        <w:tabs>
+          <w:tab w:val="num" w:pos="6480"/>
+        </w:tabs>
+        <w:ind w:left="6480" w:hanging="360"/>
+      </w:pPr>
+      <w:rPr>
+        <w:rFonts w:ascii="Wingdings" w:hAnsi="Wingdings" w:hint="default"/>
+        <w:sz w:val="20"/>
+      </w:rPr>
+    </w:lvl>
+  </w:abstractNum>
+  <w:abstractNum w:abstractNumId="12" w15:restartNumberingAfterBreak="0">
     <w:nsid w:val="137224A4"/>
     <w:multiLevelType w:val="multilevel"/>
     <w:tmpl w:val="A60ED440"/>
@@ -7655,7 +7851,7 @@
       </w:pPr>
     </w:lvl>
   </w:abstractNum>
-  <w:abstractNum w:abstractNumId="11" w15:restartNumberingAfterBreak="0">
+  <w:abstractNum w:abstractNumId="13" w15:restartNumberingAfterBreak="0">
     <w:nsid w:val="1C412DD4"/>
     <w:multiLevelType w:val="multilevel"/>
     <w:tmpl w:val="9AD8D5D6"/>
@@ -7804,7 +8000,7 @@
       </w:rPr>
     </w:lvl>
   </w:abstractNum>
-  <w:abstractNum w:abstractNumId="12" w15:restartNumberingAfterBreak="0">
+  <w:abstractNum w:abstractNumId="14" w15:restartNumberingAfterBreak="0">
     <w:nsid w:val="21626BD3"/>
     <w:multiLevelType w:val="multilevel"/>
     <w:tmpl w:val="7E087F5C"/>
@@ -7953,7 +8149,7 @@
       </w:rPr>
     </w:lvl>
   </w:abstractNum>
-  <w:abstractNum w:abstractNumId="13" w15:restartNumberingAfterBreak="0">
+  <w:abstractNum w:abstractNumId="15" w15:restartNumberingAfterBreak="0">
     <w:nsid w:val="21D227A3"/>
     <w:multiLevelType w:val="multilevel"/>
     <w:tmpl w:val="8252F0AC"/>
@@ -8066,7 +8262,7 @@
       </w:pPr>
     </w:lvl>
   </w:abstractNum>
-  <w:abstractNum w:abstractNumId="14" w15:restartNumberingAfterBreak="0">
+  <w:abstractNum w:abstractNumId="16" w15:restartNumberingAfterBreak="0">
     <w:nsid w:val="24D11A33"/>
     <w:multiLevelType w:val="multilevel"/>
     <w:tmpl w:val="83668076"/>
@@ -8179,7 +8375,156 @@
       </w:pPr>
     </w:lvl>
   </w:abstractNum>
-  <w:abstractNum w:abstractNumId="15" w15:restartNumberingAfterBreak="0">
+  <w:abstractNum w:abstractNumId="17" w15:restartNumberingAfterBreak="0">
+    <w:nsid w:val="2A8D159C"/>
+    <w:multiLevelType w:val="multilevel"/>
+    <w:tmpl w:val="551C8DE4"/>
+    <w:lvl w:ilvl="0">
+      <w:start w:val="1"/>
+      <w:numFmt w:val="bullet"/>
+      <w:lvlText w:val=""/>
+      <w:lvlJc w:val="left"/>
+      <w:pPr>
+        <w:tabs>
+          <w:tab w:val="num" w:pos="720"/>
+        </w:tabs>
+        <w:ind w:left="720" w:hanging="360"/>
+      </w:pPr>
+      <w:rPr>
+        <w:rFonts w:ascii="Symbol" w:hAnsi="Symbol" w:hint="default"/>
+        <w:sz w:val="20"/>
+      </w:rPr>
+    </w:lvl>
+    <w:lvl w:ilvl="1" w:tentative="1">
+      <w:start w:val="1"/>
+      <w:numFmt w:val="bullet"/>
+      <w:lvlText w:val="o"/>
+      <w:lvlJc w:val="left"/>
+      <w:pPr>
+        <w:tabs>
+          <w:tab w:val="num" w:pos="1440"/>
+        </w:tabs>
+        <w:ind w:left="1440" w:hanging="360"/>
+      </w:pPr>
+      <w:rPr>
+        <w:rFonts w:ascii="Courier New" w:hAnsi="Courier New" w:hint="default"/>
+        <w:sz w:val="20"/>
+      </w:rPr>
+    </w:lvl>
+    <w:lvl w:ilvl="2" w:tentative="1">
+      <w:start w:val="1"/>
+      <w:numFmt w:val="bullet"/>
+      <w:lvlText w:val=""/>
+      <w:lvlJc w:val="left"/>
+      <w:pPr>
+        <w:tabs>
+          <w:tab w:val="num" w:pos="2160"/>
+        </w:tabs>
+        <w:ind w:left="2160" w:hanging="360"/>
+      </w:pPr>
+      <w:rPr>
+        <w:rFonts w:ascii="Wingdings" w:hAnsi="Wingdings" w:hint="default"/>
+        <w:sz w:val="20"/>
+      </w:rPr>
+    </w:lvl>
+    <w:lvl w:ilvl="3" w:tentative="1">
+      <w:start w:val="1"/>
+      <w:numFmt w:val="bullet"/>
+      <w:lvlText w:val=""/>
+      <w:lvlJc w:val="left"/>
+      <w:pPr>
+        <w:tabs>
+          <w:tab w:val="num" w:pos="2880"/>
+        </w:tabs>
+        <w:ind w:left="2880" w:hanging="360"/>
+      </w:pPr>
+      <w:rPr>
+        <w:rFonts w:ascii="Wingdings" w:hAnsi="Wingdings" w:hint="default"/>
+        <w:sz w:val="20"/>
+      </w:rPr>
+    </w:lvl>
+    <w:lvl w:ilvl="4" w:tentative="1">
+      <w:start w:val="1"/>
+      <w:numFmt w:val="bullet"/>
+      <w:lvlText w:val=""/>
+      <w:lvlJc w:val="left"/>
+      <w:pPr>
+        <w:tabs>
+          <w:tab w:val="num" w:pos="3600"/>
+        </w:tabs>
+        <w:ind w:left="3600" w:hanging="360"/>
+      </w:pPr>
+      <w:rPr>
+        <w:rFonts w:ascii="Wingdings" w:hAnsi="Wingdings" w:hint="default"/>
+        <w:sz w:val="20"/>
+      </w:rPr>
+    </w:lvl>
+    <w:lvl w:ilvl="5" w:tentative="1">
+      <w:start w:val="1"/>
+      <w:numFmt w:val="bullet"/>
+      <w:lvlText w:val=""/>
+      <w:lvlJc w:val="left"/>
+      <w:pPr>
+        <w:tabs>
+          <w:tab w:val="num" w:pos="4320"/>
+        </w:tabs>
+        <w:ind w:left="4320" w:hanging="360"/>
+      </w:pPr>
+      <w:rPr>
+        <w:rFonts w:ascii="Wingdings" w:hAnsi="Wingdings" w:hint="default"/>
+        <w:sz w:val="20"/>
+      </w:rPr>
+    </w:lvl>
+    <w:lvl w:ilvl="6" w:tentative="1">
+      <w:start w:val="1"/>
+      <w:numFmt w:val="bullet"/>
+      <w:lvlText w:val=""/>
+      <w:lvlJc w:val="left"/>
+      <w:pPr>
+        <w:tabs>
+          <w:tab w:val="num" w:pos="5040"/>
+        </w:tabs>
+        <w:ind w:left="5040" w:hanging="360"/>
+      </w:pPr>
+      <w:rPr>
+        <w:rFonts w:ascii="Wingdings" w:hAnsi="Wingdings" w:hint="default"/>
+        <w:sz w:val="20"/>
+      </w:rPr>
+    </w:lvl>
+    <w:lvl w:ilvl="7" w:tentative="1">
+      <w:start w:val="1"/>
+      <w:numFmt w:val="bullet"/>
+      <w:lvlText w:val=""/>
+      <w:lvlJc w:val="left"/>
+      <w:pPr>
+        <w:tabs>
+          <w:tab w:val="num" w:pos="5760"/>
+        </w:tabs>
+        <w:ind w:left="5760" w:hanging="360"/>
+      </w:pPr>
+      <w:rPr>
+        <w:rFonts w:ascii="Wingdings" w:hAnsi="Wingdings" w:hint="default"/>
+        <w:sz w:val="20"/>
+      </w:rPr>
+    </w:lvl>
+    <w:lvl w:ilvl="8" w:tentative="1">
+      <w:start w:val="1"/>
+      <w:numFmt w:val="bullet"/>
+      <w:lvlText w:val=""/>
+      <w:lvlJc w:val="left"/>
+      <w:pPr>
+        <w:tabs>
+          <w:tab w:val="num" w:pos="6480"/>
+        </w:tabs>
+        <w:ind w:left="6480" w:hanging="360"/>
+      </w:pPr>
+      <w:rPr>
+        <w:rFonts w:ascii="Wingdings" w:hAnsi="Wingdings" w:hint="default"/>
+        <w:sz w:val="20"/>
+      </w:rPr>
+    </w:lvl>
+  </w:abstractNum>
+  <w:abstractNum w:abstractNumId="18" w15:restartNumberingAfterBreak="0">
     <w:nsid w:val="331A1FA9"/>
     <w:multiLevelType w:val="multilevel"/>
     <w:tmpl w:val="8FA4EAA2"/>
@@ -8328,7 +8673,7 @@
       </w:rPr>
     </w:lvl>
   </w:abstractNum>
-  <w:abstractNum w:abstractNumId="16" w15:restartNumberingAfterBreak="0">
+  <w:abstractNum w:abstractNumId="19" w15:restartNumberingAfterBreak="0">
     <w:nsid w:val="346D6565"/>
     <w:multiLevelType w:val="multilevel"/>
     <w:tmpl w:val="269A2B50"/>
@@ -8477,7 +8822,7 @@
       </w:rPr>
     </w:lvl>
   </w:abstractNum>
-  <w:abstractNum w:abstractNumId="17" w15:restartNumberingAfterBreak="0">
+  <w:abstractNum w:abstractNumId="20" w15:restartNumberingAfterBreak="0">
     <w:nsid w:val="37591F8E"/>
     <w:multiLevelType w:val="multilevel"/>
     <w:tmpl w:val="9B4E83FA"/>
@@ -8626,7 +8971,7 @@
       </w:rPr>
     </w:lvl>
   </w:abstractNum>
-  <w:abstractNum w:abstractNumId="18" w15:restartNumberingAfterBreak="0">
+  <w:abstractNum w:abstractNumId="21" w15:restartNumberingAfterBreak="0">
     <w:nsid w:val="40565C22"/>
     <w:multiLevelType w:val="multilevel"/>
     <w:tmpl w:val="94C609D0"/>
@@ -8775,7 +9120,7 @@
       </w:rPr>
     </w:lvl>
   </w:abstractNum>
-  <w:abstractNum w:abstractNumId="19" w15:restartNumberingAfterBreak="0">
+  <w:abstractNum w:abstractNumId="22" w15:restartNumberingAfterBreak="0">
     <w:nsid w:val="621E6D02"/>
     <w:multiLevelType w:val="multilevel"/>
     <w:tmpl w:val="7BD63042"/>
@@ -8924,7 +9269,7 @@
       </w:rPr>
     </w:lvl>
   </w:abstractNum>
-  <w:abstractNum w:abstractNumId="20" w15:restartNumberingAfterBreak="0">
+  <w:abstractNum w:abstractNumId="23" w15:restartNumberingAfterBreak="0">
     <w:nsid w:val="6C967F20"/>
     <w:multiLevelType w:val="multilevel"/>
     <w:tmpl w:val="AB72E198"/>
@@ -9073,7 +9418,156 @@
       </w:rPr>
     </w:lvl>
   </w:abstractNum>
-  <w:abstractNum w:abstractNumId="21" w15:restartNumberingAfterBreak="0">
+  <w:abstractNum w:abstractNumId="24" w15:restartNumberingAfterBreak="0">
+    <w:nsid w:val="766267F7"/>
+    <w:multiLevelType w:val="multilevel"/>
+    <w:tmpl w:val="8A1CE1B0"/>
+    <w:lvl w:ilvl="0">
+      <w:start w:val="1"/>
+      <w:numFmt w:val="bullet"/>
+      <w:lvlText w:val=""/>
+      <w:lvlJc w:val="left"/>
+      <w:pPr>
+        <w:tabs>
+          <w:tab w:val="num" w:pos="720"/>
+        </w:tabs>
+        <w:ind w:left="720" w:hanging="360"/>
+      </w:pPr>
+      <w:rPr>
+        <w:rFonts w:ascii="Symbol" w:hAnsi="Symbol" w:hint="default"/>
+        <w:sz w:val="20"/>
+      </w:rPr>
+    </w:lvl>
+    <w:lvl w:ilvl="1" w:tentative="1">
+      <w:start w:val="1"/>
+      <w:numFmt w:val="bullet"/>
+      <w:lvlText w:val="o"/>
+      <w:lvlJc w:val="left"/>
+      <w:pPr>
+        <w:tabs>
+          <w:tab w:val="num" w:pos="1440"/>
+        </w:tabs>
+        <w:ind w:left="1440" w:hanging="360"/>
+      </w:pPr>
+      <w:rPr>
+        <w:rFonts w:ascii="Courier New" w:hAnsi="Courier New" w:hint="default"/>
+        <w:sz w:val="20"/>
+      </w:rPr>
+    </w:lvl>
+    <w:lvl w:ilvl="2" w:tentative="1">
+      <w:start w:val="1"/>
+      <w:numFmt w:val="bullet"/>
+      <w:lvlText w:val=""/>
+      <w:lvlJc w:val="left"/>
+      <w:pPr>
+        <w:tabs>
+          <w:tab w:val="num" w:pos="2160"/>
+        </w:tabs>
+        <w:ind w:left="2160" w:hanging="360"/>
+      </w:pPr>
+      <w:rPr>
+        <w:rFonts w:ascii="Wingdings" w:hAnsi="Wingdings" w:hint="default"/>
+        <w:sz w:val="20"/>
+      </w:rPr>
+    </w:lvl>
+    <w:lvl w:ilvl="3" w:tentative="1">
+      <w:start w:val="1"/>
+      <w:numFmt w:val="bullet"/>
+      <w:lvlText w:val=""/>
+      <w:lvlJc w:val="left"/>
+      <w:pPr>
+        <w:tabs>
+          <w:tab w:val="num" w:pos="2880"/>
+        </w:tabs>
+        <w:ind w:left="2880" w:hanging="360"/>
+      </w:pPr>
+      <w:rPr>
+        <w:rFonts w:ascii="Wingdings" w:hAnsi="Wingdings" w:hint="default"/>
+        <w:sz w:val="20"/>
+      </w:rPr>
+    </w:lvl>
+    <w:lvl w:ilvl="4" w:tentative="1">
+      <w:start w:val="1"/>
+      <w:numFmt w:val="bullet"/>
+      <w:lvlText w:val=""/>
+      <w:lvlJc w:val="left"/>
+      <w:pPr>
+        <w:tabs>
+          <w:tab w:val="num" w:pos="3600"/>
+        </w:tabs>
+        <w:ind w:left="3600" w:hanging="360"/>
+      </w:pPr>
+      <w:rPr>
+        <w:rFonts w:ascii="Wingdings" w:hAnsi="Wingdings" w:hint="default"/>
+        <w:sz w:val="20"/>
+      </w:rPr>
+    </w:lvl>
+    <w:lvl w:ilvl="5" w:tentative="1">
+      <w:start w:val="1"/>
+      <w:numFmt w:val="bullet"/>
+      <w:lvlText w:val=""/>
+      <w:lvlJc w:val="left"/>
+      <w:pPr>
+        <w:tabs>
+          <w:tab w:val="num" w:pos="4320"/>
+        </w:tabs>
+        <w:ind w:left="4320" w:hanging="360"/>
+      </w:pPr>
+      <w:rPr>
+        <w:rFonts w:ascii="Wingdings" w:hAnsi="Wingdings" w:hint="default"/>
+        <w:sz w:val="20"/>
+      </w:rPr>
+    </w:lvl>
+    <w:lvl w:ilvl="6" w:tentative="1">
+      <w:start w:val="1"/>
+      <w:numFmt w:val="bullet"/>
+      <w:lvlText w:val=""/>
+      <w:lvlJc w:val="left"/>
+      <w:pPr>
+        <w:tabs>
+          <w:tab w:val="num" w:pos="5040"/>
+        </w:tabs>
+        <w:ind w:left="5040" w:hanging="360"/>
+      </w:pPr>
+      <w:rPr>
+        <w:rFonts w:ascii="Wingdings" w:hAnsi="Wingdings" w:hint="default"/>
+        <w:sz w:val="20"/>
+      </w:rPr>
+    </w:lvl>
+    <w:lvl w:ilvl="7" w:tentative="1">
+      <w:start w:val="1"/>
+      <w:numFmt w:val="bullet"/>
+      <w:lvlText w:val=""/>
+      <w:lvlJc w:val="left"/>
+      <w:pPr>
+        <w:tabs>
+          <w:tab w:val="num" w:pos="5760"/>
+        </w:tabs>
+        <w:ind w:left="5760" w:hanging="360"/>
+      </w:pPr>
+      <w:rPr>
+        <w:rFonts w:ascii="Wingdings" w:hAnsi="Wingdings" w:hint="default"/>
+        <w:sz w:val="20"/>
+      </w:rPr>
+    </w:lvl>
+    <w:lvl w:ilvl="8" w:tentative="1">
+      <w:start w:val="1"/>
+      <w:numFmt w:val="bullet"/>
+      <w:lvlText w:val=""/>
+      <w:lvlJc w:val="left"/>
+      <w:pPr>
+        <w:tabs>
+          <w:tab w:val="num" w:pos="6480"/>
+        </w:tabs>
+        <w:ind w:left="6480" w:hanging="360"/>
+      </w:pPr>
+      <w:rPr>
+        <w:rFonts w:ascii="Wingdings" w:hAnsi="Wingdings" w:hint="default"/>
+        <w:sz w:val="20"/>
+      </w:rPr>
+    </w:lvl>
+  </w:abstractNum>
+  <w:abstractNum w:abstractNumId="25" w15:restartNumberingAfterBreak="0">
     <w:nsid w:val="7B665C1C"/>
     <w:multiLevelType w:val="multilevel"/>
     <w:tmpl w:val="D13EDF1C"/>
@@ -9226,7 +9720,7 @@
     <w:abstractNumId w:val="4"/>
   </w:num>
   <w:num w:numId="2" w16cid:durableId="546531134">
-    <w:abstractNumId w:val="20"/>
+    <w:abstractNumId w:val="23"/>
   </w:num>
   <w:num w:numId="3" w16cid:durableId="645210317">
     <w:abstractNumId w:val="3"/>
@@ -9239,7 +9733,7 @@
     </w:lvlOverride>
   </w:num>
   <w:num w:numId="4" w16cid:durableId="1619490503">
-    <w:abstractNumId w:val="7"/>
+    <w:abstractNumId w:val="8"/>
   </w:num>
   <w:num w:numId="5" w16cid:durableId="1928995184">
     <w:abstractNumId w:val="0"/>
@@ -9248,52 +9742,64 @@
     <w:abstractNumId w:val="1"/>
   </w:num>
   <w:num w:numId="7" w16cid:durableId="506944598">
-    <w:abstractNumId w:val="10"/>
+    <w:abstractNumId w:val="12"/>
   </w:num>
   <w:num w:numId="8" w16cid:durableId="342361237">
-    <w:abstractNumId w:val="11"/>
+    <w:abstractNumId w:val="13"/>
   </w:num>
   <w:num w:numId="9" w16cid:durableId="853762425">
     <w:abstractNumId w:val="2"/>
   </w:num>
   <w:num w:numId="10" w16cid:durableId="1434981335">
+    <w:abstractNumId w:val="16"/>
+  </w:num>
+  <w:num w:numId="11" w16cid:durableId="1810395628">
+    <w:abstractNumId w:val="21"/>
+  </w:num>
+  <w:num w:numId="12" w16cid:durableId="2079279994">
+    <w:abstractNumId w:val="25"/>
+  </w:num>
+  <w:num w:numId="13" w16cid:durableId="1909995200">
+    <w:abstractNumId w:val="22"/>
+  </w:num>
+  <w:num w:numId="14" w16cid:durableId="1089813617">
     <w:abstractNumId w:val="14"/>
   </w:num>
-  <w:num w:numId="11" w16cid:durableId="1810395628">
+  <w:num w:numId="15" w16cid:durableId="1962301022">
+    <w:abstractNumId w:val="9"/>
+  </w:num>
+  <w:num w:numId="16" w16cid:durableId="13382079">
     <w:abstractNumId w:val="18"/>
   </w:num>
-  <w:num w:numId="12" w16cid:durableId="2079279994">
-    <w:abstractNumId w:val="21"/>
+  <w:num w:numId="17" w16cid:durableId="987054774">
+    <w:abstractNumId w:val="15"/>
   </w:num>
-  <w:num w:numId="13" w16cid:durableId="1909995200">
+  <w:num w:numId="18" w16cid:durableId="1400857590">
+    <w:abstractNumId w:val="10"/>
+  </w:num>
+  <w:num w:numId="19" w16cid:durableId="1975525703">
+    <w:abstractNumId w:val="6"/>
+  </w:num>
+  <w:num w:numId="20" w16cid:durableId="1981299682">
     <w:abstractNumId w:val="19"/>
   </w:num>
-  <w:num w:numId="14" w16cid:durableId="1089813617">
-    <w:abstractNumId w:val="12"/>
+  <w:num w:numId="21" w16cid:durableId="1353989381">
+    <w:abstractNumId w:val="7"/>
   </w:num>
-  <w:num w:numId="15" w16cid:durableId="1962301022">
-    <w:abstractNumId w:val="8"/>
+  <w:num w:numId="22" w16cid:durableId="1293748477">
+    <w:abstractNumId w:val="20"/>
   </w:num>
-  <w:num w:numId="16" w16cid:durableId="13382079">
-    <w:abstractNumId w:val="15"/>
+  <w:num w:numId="23" w16cid:durableId="1899242855">
+    <w:abstractNumId w:val="17"/>
   </w:num>
-  <w:num w:numId="17" w16cid:durableId="987054774">
-    <w:abstractNumId w:val="13"/>
+  <w:num w:numId="24" w16cid:durableId="156073434">
+    <w:abstractNumId w:val="11"/>
   </w:num>
-  <w:num w:numId="18" w16cid:durableId="1400857590">
-    <w:abstractNumId w:val="9"/>
-  </w:num>
-  <w:num w:numId="19" w16cid:durableId="1975525703">
+  <w:num w:numId="25" w16cid:durableId="392124197">
     <w:abstractNumId w:val="5"/>
   </w:num>
-  <w:num w:numId="20" w16cid:durableId="1981299682">
-    <w:abstractNumId w:val="16"/>
-  </w:num>
-  <w:num w:numId="21" w16cid:durableId="1353989381">
-    <w:abstractNumId w:val="6"/>
-  </w:num>
-  <w:num w:numId="22" w16cid:durableId="1293748477">
-    <w:abstractNumId w:val="17"/>
+  <w:num w:numId="26" w16cid:durableId="1593246951">
+    <w:abstractNumId w:val="24"/>
   </w:num>
 </w:numbering>
 </file>
@@ -10603,6 +11109,14 @@
 </file>
 
 <file path=customXml/item2.xml><?xml version="1.0" encoding="utf-8"?>
+<p:properties xmlns:p="http://schemas.microsoft.com/office/2006/metadata/properties" xmlns:xsi="http://www.w3.org/2001/XMLSchema-instance" xmlns:pc="http://schemas.microsoft.com/office/infopath/2007/PartnerControls">
+  <documentManagement>
+    <_activity xmlns="bf1aeac4-b4d7-4212-b274-a26dc3320985" xsi:nil="true"/>
+  </documentManagement>
+</p:properties>
+</file>
+
+<file path=customXml/item3.xml><?xml version="1.0" encoding="utf-8"?>
 <ct:contentTypeSchema xmlns:ct="http://schemas.microsoft.com/office/2006/metadata/contentType" xmlns:ma="http://schemas.microsoft.com/office/2006/metadata/properties/metaAttributes" ct:_="" ma:_="" ma:contentTypeName="Έγγραφο" ma:contentTypeID="0x010100B5120FA70595F945BD5FE61B11330EED" ma:contentTypeVersion="7" ma:contentTypeDescription="Δημιουργία νέου εγγράφου" ma:contentTypeScope="" ma:versionID="9cacf32d8fdd668c5bfe71623df6ac90">
   <xsd:schema xmlns:xsd="http://www.w3.org/2001/XMLSchema" xmlns:xs="http://www.w3.org/2001/XMLSchema" xmlns:p="http://schemas.microsoft.com/office/2006/metadata/properties" xmlns:ns3="bf1aeac4-b4d7-4212-b274-a26dc3320985" targetNamespace="http://schemas.microsoft.com/office/2006/metadata/properties" ma:root="true" ma:fieldsID="b257e0277dd92af19c418dda5de4e143" ns3:_="">
     <xsd:import namespace="bf1aeac4-b4d7-4212-b274-a26dc3320985"/>
@@ -10764,14 +11278,6 @@
 </ct:contentTypeSchema>
 </file>
 
-<file path=customXml/item3.xml><?xml version="1.0" encoding="utf-8"?>
-<p:properties xmlns:p="http://schemas.microsoft.com/office/2006/metadata/properties" xmlns:xsi="http://www.w3.org/2001/XMLSchema-instance" xmlns:pc="http://schemas.microsoft.com/office/infopath/2007/PartnerControls">
-  <documentManagement>
-    <_activity xmlns="bf1aeac4-b4d7-4212-b274-a26dc3320985" xsi:nil="true"/>
-  </documentManagement>
-</p:properties>
-</file>
-
 <file path=customXml/itemProps1.xml><?xml version="1.0" encoding="utf-8"?>
 <ds:datastoreItem xmlns:ds="http://schemas.openxmlformats.org/officeDocument/2006/customXml" ds:itemID="{0FC4E3BA-50BD-4C6E-8AB4-572374B655C5}">
   <ds:schemaRefs>
@@ -10781,6 +11287,16 @@
 </file>
 
 <file path=customXml/itemProps2.xml><?xml version="1.0" encoding="utf-8"?>
+<ds:datastoreItem xmlns:ds="http://schemas.openxmlformats.org/officeDocument/2006/customXml" ds:itemID="{2E3BCF71-9EF5-4EB7-B704-5C7ACDF181C0}">
+  <ds:schemaRefs>
+    <ds:schemaRef ds:uri="http://schemas.microsoft.com/office/2006/metadata/properties"/>
+    <ds:schemaRef ds:uri="http://schemas.microsoft.com/office/infopath/2007/PartnerControls"/>
+    <ds:schemaRef ds:uri="bf1aeac4-b4d7-4212-b274-a26dc3320985"/>
+  </ds:schemaRefs>
+</ds:datastoreItem>
+</file>
+
+<file path=customXml/itemProps3.xml><?xml version="1.0" encoding="utf-8"?>
 <ds:datastoreItem xmlns:ds="http://schemas.openxmlformats.org/officeDocument/2006/customXml" ds:itemID="{3E8B8E9B-E095-4045-9320-FAD084155FC1}">
   <ds:schemaRefs>
     <ds:schemaRef ds:uri="http://schemas.microsoft.com/office/2006/metadata/contentType"/>
@@ -10796,14 +11312,4 @@
     <ds:schemaRef ds:uri="http://schemas.microsoft.com/internal/obd"/>
   </ds:schemaRefs>
 </ds:datastoreItem>
-</file>
-
-<file path=customXml/itemProps3.xml><?xml version="1.0" encoding="utf-8"?>
-<ds:datastoreItem xmlns:ds="http://schemas.openxmlformats.org/officeDocument/2006/customXml" ds:itemID="{2E3BCF71-9EF5-4EB7-B704-5C7ACDF181C0}">
-  <ds:schemaRefs>
-    <ds:schemaRef ds:uri="http://schemas.microsoft.com/office/2006/metadata/properties"/>
-    <ds:schemaRef ds:uri="http://schemas.microsoft.com/office/infopath/2007/PartnerControls"/>
-    <ds:schemaRef ds:uri="bf1aeac4-b4d7-4212-b274-a26dc3320985"/>
-  </ds:schemaRefs>
-</ds:datastoreItem>
 </file>
</xml_diff>